<commit_message>
feat(timbrado): atualiza modelo oficial (eixo gov) e torna dinâmica extração de imagens no DOCX
</commit_message>
<xml_diff>
--- a/outros/templates/timbrado_eleicoes.docx
+++ b/outros/templates/timbrado_eleicoes.docx
@@ -131,17 +131,17 @@
             <wp:extent cx="7576714" cy="767740"/>
             <wp:effectExtent b="0" l="0" r="0" t="0"/>
             <wp:wrapNone/>
-            <wp:docPr id="5" name="image2.png"/>
+            <wp:docPr id="5" name="image1.png"/>
             <a:graphic>
               <a:graphicData uri="http://schemas.openxmlformats.org/drawingml/2006/picture">
                 <pic:pic>
                   <pic:nvPicPr>
-                    <pic:cNvPr id="0" name="image2.png"/>
+                    <pic:cNvPr id="0" name="image1.png"/>
                     <pic:cNvPicPr preferRelativeResize="0"/>
                   </pic:nvPicPr>
                   <pic:blipFill>
                     <a:blip r:embed="rId7"/>
-                    <a:srcRect b="100" l="0" r="0" t="100"/>
+                    <a:srcRect b="0" l="126" r="126" t="0"/>
                     <a:stretch>
                       <a:fillRect/>
                     </a:stretch>
@@ -227,17 +227,17 @@
           <wp:extent cx="7514225" cy="2014538"/>
           <wp:effectExtent b="0" l="0" r="0" t="0"/>
           <wp:wrapNone/>
-          <wp:docPr id="6" name="image1.png"/>
+          <wp:docPr id="6" name="image2.png"/>
           <a:graphic>
             <a:graphicData uri="http://schemas.openxmlformats.org/drawingml/2006/picture">
               <pic:pic>
                 <pic:nvPicPr>
-                  <pic:cNvPr id="0" name="image1.png"/>
+                  <pic:cNvPr id="0" name="image2.png"/>
                   <pic:cNvPicPr preferRelativeResize="0"/>
                 </pic:nvPicPr>
                 <pic:blipFill>
                   <a:blip r:embed="rId1"/>
-                  <a:srcRect b="0" l="106" r="106" t="0"/>
+                  <a:srcRect b="0" l="97" r="97" t="0"/>
                   <a:stretch>
                     <a:fillRect/>
                   </a:stretch>

</xml_diff>